<commit_message>
Update resume to include Software Developer Intern experience and add HTMX to skills
</commit_message>
<xml_diff>
--- a/documents/Pierre-Kahunda-Resume.docx
+++ b/documents/Pierre-Kahunda-Resume.docx
@@ -157,6 +157,164 @@
           <w:sz w:val="22"/>
           <w:szCs w:val="22"/>
         </w:rPr>
+        <w:t xml:space="preserve">EXPERIENCE</w:t>
+      </w:r>
+    </w:p>
+    <w:p>
+      <w:pPr>
+        <w:spacing w:after="40" w:before="180"/>
+      </w:pPr>
+      <w:r>
+        <w:rPr>
+          <w:rFonts w:ascii="Arial" w:cs="Arial" w:eastAsia="Arial" w:hAnsi="Arial"/>
+          <w:b/>
+          <w:bCs/>
+          <w:sz w:val="22"/>
+          <w:szCs w:val="22"/>
+        </w:rPr>
+        <w:t xml:space="preserve">Software Developer Intern</w:t>
+      </w:r>
+      <w:r>
+        <w:rPr>
+          <w:rFonts w:ascii="Arial" w:cs="Arial" w:eastAsia="Arial" w:hAnsi="Arial"/>
+          <w:color w:val="555555"/>
+          <w:sz w:val="22"/>
+          <w:szCs w:val="22"/>
+        </w:rPr>
+        <w:t xml:space="preserve">  —  </w:t>
+      </w:r>
+      <w:r>
+        <w:rPr>
+          <w:rFonts w:ascii="Arial" w:cs="Arial" w:eastAsia="Arial" w:hAnsi="Arial"/>
+          <w:i/>
+          <w:iCs/>
+          <w:sz w:val="22"/>
+          <w:szCs w:val="22"/>
+        </w:rPr>
+        <w:t xml:space="preserve">Compuways</w:t>
+      </w:r>
+      <w:r>
+        <w:rPr>
+          <w:rFonts w:ascii="Arial" w:cs="Arial" w:eastAsia="Arial" w:hAnsi="Arial"/>
+          <w:color w:val="555555"/>
+          <w:sz w:val="20"/>
+          <w:szCs w:val="20"/>
+        </w:rPr>
+        <w:t xml:space="preserve">  ·  Feb 2025 – Mar 2026  ·  Johannesburg, SA</w:t>
+      </w:r>
+    </w:p>
+    <w:p>
+      <w:pPr>
+        <w:pStyle w:val="ListParagraph"/>
+        <w:numPr>
+          <w:ilvl w:val="0"/>
+          <w:numId w:val="2"/>
+        </w:numPr>
+        <w:spacing w:after="40" w:before="40"/>
+      </w:pPr>
+      <w:r>
+        <w:rPr>
+          <w:rFonts w:ascii="Arial" w:cs="Arial" w:eastAsia="Arial" w:hAnsi="Arial"/>
+          <w:color w:val="222222"/>
+          <w:sz w:val="20"/>
+          <w:szCs w:val="20"/>
+        </w:rPr>
+        <w:t xml:space="preserve">Diagnosed and resolved bugs in existing source code across multiple languages and frameworks.</w:t>
+      </w:r>
+    </w:p>
+    <w:p>
+      <w:pPr>
+        <w:pStyle w:val="ListParagraph"/>
+        <w:numPr>
+          <w:ilvl w:val="0"/>
+          <w:numId w:val="2"/>
+        </w:numPr>
+        <w:spacing w:after="40" w:before="40"/>
+      </w:pPr>
+      <w:r>
+        <w:rPr>
+          <w:rFonts w:ascii="Arial" w:cs="Arial" w:eastAsia="Arial" w:hAnsi="Arial"/>
+          <w:color w:val="222222"/>
+          <w:sz w:val="20"/>
+          <w:szCs w:val="20"/>
+        </w:rPr>
+        <w:t xml:space="preserve">Collaborated with cohort peers on team projects, contributing to design decisions and implementation.</w:t>
+      </w:r>
+    </w:p>
+    <w:p>
+      <w:pPr>
+        <w:pStyle w:val="ListParagraph"/>
+        <w:numPr>
+          <w:ilvl w:val="0"/>
+          <w:numId w:val="2"/>
+        </w:numPr>
+        <w:spacing w:after="40" w:before="40"/>
+      </w:pPr>
+      <w:r>
+        <w:rPr>
+          <w:rFonts w:ascii="Arial" w:cs="Arial" w:eastAsia="Arial" w:hAnsi="Arial"/>
+          <w:color w:val="222222"/>
+          <w:sz w:val="20"/>
+          <w:szCs w:val="20"/>
+        </w:rPr>
+        <w:t xml:space="preserve">Built and presented individual end-of-module projects, explaining technical decisions and architecture to instructors.</w:t>
+      </w:r>
+    </w:p>
+    <w:p>
+      <w:pPr>
+        <w:pStyle w:val="ListParagraph"/>
+        <w:numPr>
+          <w:ilvl w:val="0"/>
+          <w:numId w:val="2"/>
+        </w:numPr>
+        <w:spacing w:after="40" w:before="40"/>
+      </w:pPr>
+      <w:r>
+        <w:rPr>
+          <w:rFonts w:ascii="Arial" w:cs="Arial" w:eastAsia="Arial" w:hAnsi="Arial"/>
+          <w:color w:val="222222"/>
+          <w:sz w:val="20"/>
+          <w:szCs w:val="20"/>
+        </w:rPr>
+        <w:t xml:space="preserve">Created technical walkthroughs and video demonstrations of programming concepts for each module.</w:t>
+      </w:r>
+    </w:p>
+    <w:p>
+      <w:pPr>
+        <w:pStyle w:val="ListParagraph"/>
+        <w:numPr>
+          <w:ilvl w:val="0"/>
+          <w:numId w:val="2"/>
+        </w:numPr>
+        <w:spacing w:after="40" w:before="40"/>
+      </w:pPr>
+      <w:r>
+        <w:rPr>
+          <w:rFonts w:ascii="Arial" w:cs="Arial" w:eastAsia="Arial" w:hAnsi="Arial"/>
+          <w:color w:val="222222"/>
+          <w:sz w:val="20"/>
+          <w:szCs w:val="20"/>
+        </w:rPr>
+        <w:t xml:space="preserve">Debugged and reviewed peers’ code, developing an eye for common failure points early in the development lifecycle.</w:t>
+      </w:r>
+    </w:p>
+    <w:p>
+      <w:pPr>
+        <w:pBdr>
+          <w:bottom w:val="single" w:color="2563EB" w:sz="6" w:space="4"/>
+        </w:pBdr>
+        <w:spacing w:after="80" w:before="280"/>
+      </w:pPr>
+      <w:r>
+        <w:rPr>
+          <w:rFonts w:ascii="Arial" w:cs="Arial" w:eastAsia="Arial" w:hAnsi="Arial"/>
+          <w:b/>
+          <w:bCs/>
+          <w:color w:val="1E3A5F"/>
+          <w:spacing w:val="40"/>
+          <w:sz w:val="22"/>
+          <w:szCs w:val="22"/>
+        </w:rPr>
         <w:t xml:space="preserve">PROJECTS</w:t>
       </w:r>
     </w:p>
@@ -789,7 +947,7 @@
           <w:sz w:val="20"/>
           <w:szCs w:val="20"/>
         </w:rPr>
-        <w:t xml:space="preserve">HTML, CSS, JavaScript, React, Vite</w:t>
+        <w:t xml:space="preserve">HTML, CSS, JavaScript, React, Vite, HTMX</w:t>
       </w:r>
     </w:p>
     <w:p>

</xml_diff>